<commit_message>
docs: update progress guide 2.4 to the 2026-10-21 cut (#37)
</commit_message>
<xml_diff>
--- a/Fase 2/2.4_GuiaEstudiante_Fase 2_DesarrolloProyecto APT.docx
+++ b/Fase 2/2.4_GuiaEstudiante_Fase 2_DesarrolloProyecto APT.docx
@@ -527,7 +527,7 @@
                 <w:sz w:val="22"/>
                 <w:szCs w:val="22"/>
               </w:rPr>
-              <w:t xml:space="preserve"> 20-10-2026.</w:t>
+              <w:t xml:space="preserve"> 21-10-2026.</w:t>
             </w:r>
           </w:p>
           <w:p>
@@ -662,7 +662,7 @@
                 <w:sz w:val="22"/>
                 <w:szCs w:val="22"/>
               </w:rPr>
-              <w:t xml:space="preserve">Además, la aplicación web (Django) ya tiene login por perfil (CU00), gestión de usuarios y roles (CU06), carga y análisis de fotos (CU01) y alertas con estado para el reponedor (CU02). En gestión, el equipo trabaja con ramas, Pull Requests, integración continua y una bitácora del proyecto (PROGRESS.md).</w:t>
+              <w:t xml:space="preserve">Además, la aplicación web (Django) ya tiene login por perfil (CU00), gestión de usuarios y roles (CU06), carga y análisis de fotos (CU01) alertas con estado para el reponedor (CU02) y exportación de reportes en Excel, CSV y PDF (CU04). Las plantillas de casos de uso y sus diagramas se rehicieron según la aplicación Django. En gestión, el equipo trabaja con ramas, Pull Requests, integración continua y una bitácora del proyecto (PROGRESS.md).</w:t>
             </w:r>
           </w:p>
           <w:p>
@@ -988,7 +988,7 @@
                 <w:sz w:val="22"/>
                 <w:szCs w:val="22"/>
               </w:rPr>
-              <w:t xml:space="preserve"> CU00, CU01, CU02 y CU06 operativos.</w:t>
+              <w:t xml:space="preserve"> CU00, CU01, CU02, CU04 y CU06 operativos (5 de 8, más CU07 por línea de comandos); con esto se alcanza la meta de la Evaluación 2.</w:t>
             </w:r>
           </w:p>
           <w:p>
@@ -1413,7 +1413,7 @@
                 <w:sz w:val="22"/>
                 <w:szCs w:val="22"/>
               </w:rPr>
-              <w:t xml:space="preserve"> (web/, docs/auditoria-app-web.md): login por rol, CRUD de usuarios, análisis y alertas guardados en la base de datos. Demuestra OE4 y el modelo de datos.</w:t>
+              <w:t xml:space="preserve"> (web/, docs/auditoria-app-web.md): login por rol, CRUD de usuarios, análisis y alertas guardados en la base de datos, y reportes en Excel, CSV y PDF (src/reporting/export.py). Demuestra OE4 y el modelo de datos.</w:t>
             </w:r>
           </w:p>
           <w:p>
@@ -1500,7 +1500,7 @@
                 <w:sz w:val="22"/>
                 <w:szCs w:val="22"/>
               </w:rPr>
-              <w:t xml:space="preserve"> (tests/, .github/workflows/ci.yml): 185 pruebas que corren en cada Pull Request. Demuestra OE5.</w:t>
+              <w:t xml:space="preserve"> (tests/, .github/workflows/ci.yml): 231 pruebas que corren en cada Pull Request. Demuestra OE5.</w:t>
             </w:r>
           </w:p>
           <w:p>
@@ -4038,7 +4038,7 @@
                 <w:sz w:val="16"/>
                 <w:szCs w:val="16"/>
               </w:rPr>
-              <w:t xml:space="preserve">openpyxl, fpdf2</w:t>
+              <w:t xml:space="preserve">openpyxl, fpdf2, Django</w:t>
             </w:r>
           </w:p>
         </w:tc>
@@ -4058,7 +4058,7 @@
                 <w:sz w:val="16"/>
                 <w:szCs w:val="16"/>
               </w:rPr>
-              <w:t xml:space="preserve">20-10 al 27-10</w:t>
+              <w:t xml:space="preserve">21-10</w:t>
             </w:r>
           </w:p>
         </w:tc>
@@ -4098,7 +4098,7 @@
                 <w:sz w:val="16"/>
                 <w:szCs w:val="16"/>
               </w:rPr>
-              <w:t xml:space="preserve">Fechas propuestas</w:t>
+              <w:t xml:space="preserve">Página Reportes de la app web; 13 pruebas</w:t>
             </w:r>
           </w:p>
         </w:tc>
@@ -4118,7 +4118,7 @@
                 <w:sz w:val="16"/>
                 <w:szCs w:val="16"/>
               </w:rPr>
-              <w:t xml:space="preserve">No iniciado</w:t>
+              <w:t xml:space="preserve">Completado</w:t>
             </w:r>
           </w:p>
         </w:tc>
@@ -4138,7 +4138,7 @@
                 <w:sz w:val="16"/>
                 <w:szCs w:val="16"/>
               </w:rPr>
-              <w:t xml:space="preserve">-</w:t>
+              <w:t xml:space="preserve">Antes del plazo (27-10)</w:t>
             </w:r>
           </w:p>
         </w:tc>
@@ -5088,7 +5088,7 @@
                 <w:sz w:val="16"/>
                 <w:szCs w:val="16"/>
               </w:rPr>
-              <w:t xml:space="preserve">Falta adaptarlos a Django</w:t>
+              <w:t xml:space="preserve">-</w:t>
             </w:r>
           </w:p>
         </w:tc>
@@ -5153,7 +5153,7 @@
                 <w:sz w:val="16"/>
                 <w:szCs w:val="16"/>
               </w:rPr>
-              <w:t xml:space="preserve">C2. Evaluar y gestionar proyectos</w:t>
+              <w:t xml:space="preserve">C3. Ingeniería de requisitos</w:t>
             </w:r>
           </w:p>
         </w:tc>
@@ -5173,7 +5173,7 @@
                 <w:sz w:val="16"/>
                 <w:szCs w:val="16"/>
               </w:rPr>
-              <w:t xml:space="preserve">Plan de mejoras de la Fase 1</w:t>
+              <w:t xml:space="preserve">Plantillas de C.U y diagramas según la app Django (#42)</w:t>
             </w:r>
           </w:p>
         </w:tc>
@@ -5193,7 +5193,7 @@
                 <w:sz w:val="16"/>
                 <w:szCs w:val="16"/>
               </w:rPr>
-              <w:t xml:space="preserve">docs/plan-de-mejoras.md</w:t>
+              <w:t xml:space="preserve">Plantillas de C.U, Mermaid</w:t>
             </w:r>
           </w:p>
         </w:tc>
@@ -5213,7 +5213,7 @@
                 <w:sz w:val="16"/>
                 <w:szCs w:val="16"/>
               </w:rPr>
-              <w:t xml:space="preserve">20-10</w:t>
+              <w:t xml:space="preserve">21-10</w:t>
             </w:r>
           </w:p>
         </w:tc>
@@ -5253,7 +5253,7 @@
                 <w:sz w:val="16"/>
                 <w:szCs w:val="16"/>
               </w:rPr>
-              <w:t xml:space="preserve">Plazo 09-10</w:t>
+              <w:t xml:space="preserve">CU00-CU06 y arquitectura</w:t>
             </w:r>
           </w:p>
         </w:tc>
@@ -5273,7 +5273,7 @@
                 <w:sz w:val="16"/>
                 <w:szCs w:val="16"/>
               </w:rPr>
-              <w:t xml:space="preserve">Con retraso</w:t>
+              <w:t xml:space="preserve">Completado</w:t>
             </w:r>
           </w:p>
         </w:tc>
@@ -5293,7 +5293,7 @@
                 <w:sz w:val="16"/>
                 <w:szCs w:val="16"/>
               </w:rPr>
-              <w:t xml:space="preserve">Terminado el 20-10</w:t>
+              <w:t xml:space="preserve">Sin API REST, JWT ni React</w:t>
             </w:r>
           </w:p>
         </w:tc>
@@ -5338,7 +5338,7 @@
                 <w:sz w:val="16"/>
                 <w:szCs w:val="16"/>
               </w:rPr>
-              <w:t xml:space="preserve">Informe intermedio</w:t>
+              <w:t xml:space="preserve">Plan de mejoras de la Fase 1</w:t>
             </w:r>
           </w:p>
         </w:tc>
@@ -5358,7 +5358,7 @@
                 <w:sz w:val="16"/>
                 <w:szCs w:val="16"/>
               </w:rPr>
-              <w:t xml:space="preserve">Word</w:t>
+              <w:t xml:space="preserve">docs/plan-de-mejoras.md</w:t>
             </w:r>
           </w:p>
         </w:tc>
@@ -5378,7 +5378,7 @@
                 <w:sz w:val="16"/>
                 <w:szCs w:val="16"/>
               </w:rPr>
-              <w:t xml:space="preserve">19-10 al 21-10</w:t>
+              <w:t xml:space="preserve">20-10</w:t>
             </w:r>
           </w:p>
         </w:tc>
@@ -5398,7 +5398,7 @@
                 <w:sz w:val="16"/>
                 <w:szCs w:val="16"/>
               </w:rPr>
-              <w:t xml:space="preserve">Francisco</w:t>
+              <w:t xml:space="preserve">Mariana</w:t>
             </w:r>
           </w:p>
         </w:tc>
@@ -5418,7 +5418,7 @@
                 <w:sz w:val="16"/>
                 <w:szCs w:val="16"/>
               </w:rPr>
-              <w:t xml:space="preserve">Borrador en Fase 2/; entrega 21-10</w:t>
+              <w:t xml:space="preserve">Plazo 09-10</w:t>
             </w:r>
           </w:p>
         </w:tc>
@@ -5438,7 +5438,7 @@
                 <w:sz w:val="16"/>
                 <w:szCs w:val="16"/>
               </w:rPr>
-              <w:t xml:space="preserve">En curso</w:t>
+              <w:t xml:space="preserve">Con retraso</w:t>
             </w:r>
           </w:p>
         </w:tc>
@@ -5458,7 +5458,7 @@
                 <w:sz w:val="16"/>
                 <w:szCs w:val="16"/>
               </w:rPr>
-              <w:t xml:space="preserve">Reasignado de Nicko</w:t>
+              <w:t xml:space="preserve">Terminado el 20-10</w:t>
             </w:r>
           </w:p>
         </w:tc>
@@ -5483,7 +5483,7 @@
                 <w:sz w:val="16"/>
                 <w:szCs w:val="16"/>
               </w:rPr>
-              <w:t xml:space="preserve">C1. Diseñar y generar soluciones de software</w:t>
+              <w:t xml:space="preserve">C2. Evaluar y gestionar proyectos</w:t>
             </w:r>
           </w:p>
         </w:tc>
@@ -5503,7 +5503,7 @@
                 <w:sz w:val="16"/>
                 <w:szCs w:val="16"/>
               </w:rPr>
-              <w:t xml:space="preserve">Análisis de resultados: 10 mejores y 10 peores casos</w:t>
+              <w:t xml:space="preserve">Informe intermedio</w:t>
             </w:r>
           </w:p>
         </w:tc>
@@ -5523,7 +5523,7 @@
                 <w:sz w:val="16"/>
                 <w:szCs w:val="16"/>
               </w:rPr>
-              <w:t xml:space="preserve">Kaggle CC0, pipeline</w:t>
+              <w:t xml:space="preserve">Word</w:t>
             </w:r>
           </w:p>
         </w:tc>
@@ -5543,7 +5543,7 @@
                 <w:sz w:val="16"/>
                 <w:szCs w:val="16"/>
               </w:rPr>
-              <w:t xml:space="preserve">20-10</w:t>
+              <w:t xml:space="preserve">19-10 al 21-10</w:t>
             </w:r>
           </w:p>
         </w:tc>
@@ -5583,7 +5583,7 @@
                 <w:sz w:val="16"/>
                 <w:szCs w:val="16"/>
               </w:rPr>
-              <w:t xml:space="preserve">Alerta correcta en el 84% de 44 fotos</w:t>
+              <w:t xml:space="preserve">Borrador en Fase 2/; entrega 21-10</w:t>
             </w:r>
           </w:p>
         </w:tc>
@@ -5603,7 +5603,7 @@
                 <w:sz w:val="16"/>
                 <w:szCs w:val="16"/>
               </w:rPr>
-              <w:t xml:space="preserve">Completado</w:t>
+              <w:t xml:space="preserve">En curso</w:t>
             </w:r>
           </w:p>
         </w:tc>
@@ -5623,7 +5623,7 @@
                 <w:sz w:val="16"/>
                 <w:szCs w:val="16"/>
               </w:rPr>
-              <w:t xml:space="preserve">-</w:t>
+              <w:t xml:space="preserve">Reasignado de Nicko</w:t>
             </w:r>
           </w:p>
         </w:tc>
@@ -5648,7 +5648,7 @@
                 <w:sz w:val="16"/>
                 <w:szCs w:val="16"/>
               </w:rPr>
-              <w:t xml:space="preserve">C2. Evaluar y gestionar proyectos</w:t>
+              <w:t xml:space="preserve">C1. Diseñar y generar soluciones de software</w:t>
             </w:r>
           </w:p>
         </w:tc>
@@ -5668,7 +5668,7 @@
                 <w:sz w:val="16"/>
                 <w:szCs w:val="16"/>
               </w:rPr>
-              <w:t xml:space="preserve">README completo</w:t>
+              <w:t xml:space="preserve">Análisis de resultados: 10 mejores y 10 peores casos</w:t>
             </w:r>
           </w:p>
         </w:tc>
@@ -5688,7 +5688,7 @@
                 <w:sz w:val="16"/>
                 <w:szCs w:val="16"/>
               </w:rPr>
-              <w:t xml:space="preserve">README.md</w:t>
+              <w:t xml:space="preserve">Kaggle CC0, pipeline</w:t>
             </w:r>
           </w:p>
         </w:tc>
@@ -5748,7 +5748,7 @@
                 <w:sz w:val="16"/>
                 <w:szCs w:val="16"/>
               </w:rPr>
-              <w:t xml:space="preserve">Ejemplo reproducible</w:t>
+              <w:t xml:space="preserve">Alerta correcta en el 84% de 44 fotos</w:t>
             </w:r>
           </w:p>
         </w:tc>
@@ -5833,7 +5833,7 @@
                 <w:sz w:val="16"/>
                 <w:szCs w:val="16"/>
               </w:rPr>
-              <w:t xml:space="preserve">Video de demostración (5 a 10 min)</w:t>
+              <w:t xml:space="preserve">README completo</w:t>
             </w:r>
           </w:p>
         </w:tc>
@@ -5853,7 +5853,7 @@
                 <w:sz w:val="16"/>
                 <w:szCs w:val="16"/>
               </w:rPr>
-              <w:t xml:space="preserve">App web, fotos sin SKU-110K</w:t>
+              <w:t xml:space="preserve">README.md</w:t>
             </w:r>
           </w:p>
         </w:tc>
@@ -5873,7 +5873,7 @@
                 <w:sz w:val="16"/>
                 <w:szCs w:val="16"/>
               </w:rPr>
-              <w:t xml:space="preserve">21-10</w:t>
+              <w:t xml:space="preserve">20-10</w:t>
             </w:r>
           </w:p>
         </w:tc>
@@ -5893,7 +5893,7 @@
                 <w:sz w:val="16"/>
                 <w:szCs w:val="16"/>
               </w:rPr>
-              <w:t xml:space="preserve">Nicko</w:t>
+              <w:t xml:space="preserve">Francisco</w:t>
             </w:r>
           </w:p>
         </w:tc>
@@ -5913,7 +5913,7 @@
                 <w:sz w:val="16"/>
                 <w:szCs w:val="16"/>
               </w:rPr>
-              <w:t xml:space="preserve">Entrega 21-10</w:t>
+              <w:t xml:space="preserve">Ejemplo reproducible</w:t>
             </w:r>
           </w:p>
         </w:tc>
@@ -5933,7 +5933,7 @@
                 <w:sz w:val="16"/>
                 <w:szCs w:val="16"/>
               </w:rPr>
-              <w:t xml:space="preserve">No iniciado</w:t>
+              <w:t xml:space="preserve">Completado</w:t>
             </w:r>
           </w:p>
         </w:tc>
@@ -5953,7 +5953,7 @@
                 <w:sz w:val="16"/>
                 <w:szCs w:val="16"/>
               </w:rPr>
-              <w:t xml:space="preserve">Reasignado de Francisco</w:t>
+              <w:t xml:space="preserve">-</w:t>
             </w:r>
           </w:p>
         </w:tc>
@@ -5998,7 +5998,7 @@
                 <w:sz w:val="16"/>
                 <w:szCs w:val="16"/>
               </w:rPr>
-              <w:t xml:space="preserve">Evidencias de avance (diario 2.1 y guía 2.4)</w:t>
+              <w:t xml:space="preserve">Video de demostración (5 a 10 min)</w:t>
             </w:r>
           </w:p>
         </w:tc>
@@ -6018,7 +6018,7 @@
                 <w:sz w:val="16"/>
                 <w:szCs w:val="16"/>
               </w:rPr>
-              <w:t xml:space="preserve">Plantillas del curso</w:t>
+              <w:t xml:space="preserve">App web, fotos sin SKU-110K</w:t>
             </w:r>
           </w:p>
         </w:tc>
@@ -6038,7 +6038,7 @@
                 <w:sz w:val="16"/>
                 <w:szCs w:val="16"/>
               </w:rPr>
-              <w:t xml:space="preserve">20-10 al 26-10</w:t>
+              <w:t xml:space="preserve">21-10</w:t>
             </w:r>
           </w:p>
         </w:tc>
@@ -6058,7 +6058,7 @@
                 <w:sz w:val="16"/>
                 <w:szCs w:val="16"/>
               </w:rPr>
-              <w:t xml:space="preserve">Mariana</w:t>
+              <w:t xml:space="preserve">Nicko</w:t>
             </w:r>
           </w:p>
         </w:tc>
@@ -6078,7 +6078,7 @@
                 <w:sz w:val="16"/>
                 <w:szCs w:val="16"/>
               </w:rPr>
-              <w:t xml:space="preserve">Entrega 26-10</w:t>
+              <w:t xml:space="preserve">Entrega 21-10</w:t>
             </w:r>
           </w:p>
         </w:tc>
@@ -6098,7 +6098,7 @@
                 <w:sz w:val="16"/>
                 <w:szCs w:val="16"/>
               </w:rPr>
-              <w:t xml:space="preserve">En curso</w:t>
+              <w:t xml:space="preserve">No iniciado</w:t>
             </w:r>
           </w:p>
         </w:tc>
@@ -6118,7 +6118,7 @@
                 <w:sz w:val="16"/>
                 <w:szCs w:val="16"/>
               </w:rPr>
-              <w:t xml:space="preserve">-</w:t>
+              <w:t xml:space="preserve">Reasignado de Francisco</w:t>
             </w:r>
           </w:p>
         </w:tc>
@@ -6163,7 +6163,7 @@
                 <w:sz w:val="16"/>
                 <w:szCs w:val="16"/>
               </w:rPr>
-              <w:t xml:space="preserve">Feria de informática</w:t>
+              <w:t xml:space="preserve">Evidencias de avance (diario 2.1 y guía 2.4)</w:t>
             </w:r>
           </w:p>
         </w:tc>
@@ -6183,7 +6183,7 @@
                 <w:sz w:val="16"/>
                 <w:szCs w:val="16"/>
               </w:rPr>
-              <w:t xml:space="preserve">-</w:t>
+              <w:t xml:space="preserve">Plantillas del curso</w:t>
             </w:r>
           </w:p>
         </w:tc>
@@ -6203,7 +6203,7 @@
                 <w:sz w:val="16"/>
                 <w:szCs w:val="16"/>
               </w:rPr>
-              <w:t xml:space="preserve">Semana del 26-10</w:t>
+              <w:t xml:space="preserve">20-10 al 26-10</w:t>
             </w:r>
           </w:p>
         </w:tc>
@@ -6223,7 +6223,7 @@
                 <w:sz w:val="16"/>
                 <w:szCs w:val="16"/>
               </w:rPr>
-              <w:t xml:space="preserve">Nicko</w:t>
+              <w:t xml:space="preserve">Mariana</w:t>
             </w:r>
           </w:p>
         </w:tc>
@@ -6243,7 +6243,7 @@
                 <w:sz w:val="16"/>
                 <w:szCs w:val="16"/>
               </w:rPr>
-              <w:t xml:space="preserve">Día y hora por informar</w:t>
+              <w:t xml:space="preserve">Entrega 26-10</w:t>
             </w:r>
           </w:p>
         </w:tc>
@@ -6263,7 +6263,7 @@
                 <w:sz w:val="16"/>
                 <w:szCs w:val="16"/>
               </w:rPr>
-              <w:t xml:space="preserve">No iniciado</w:t>
+              <w:t xml:space="preserve">En curso</w:t>
             </w:r>
           </w:p>
         </w:tc>
@@ -6289,6 +6289,171 @@
         </w:tc>
       </w:tr>
       <w:tr>
+        <w:trPr>
+          <w:cantSplit/>
+        </w:trPr>
+        <w:tc>
+          <w:tcPr>
+            <w:tcW w:w="1328" w:type="dxa"/>
+          </w:tcPr>
+          <w:p>
+            <w:pPr>
+              <w:spacing w:before="0" w:after="0" w:line="259" w:lineRule="auto"/>
+              <w:jc w:val="left"/>
+            </w:pPr>
+            <w:r>
+              <w:rPr>
+                <w:rFonts w:ascii="Calibri" w:hAnsi="Calibri" w:cs="Calibri"/>
+                <w:color w:val="000000"/>
+                <w:sz w:val="16"/>
+                <w:szCs w:val="16"/>
+              </w:rPr>
+              <w:t xml:space="preserve">C2. Evaluar y gestionar proyectos</w:t>
+            </w:r>
+          </w:p>
+        </w:tc>
+        <w:tc>
+          <w:tcPr>
+            <w:tcW w:w="1077" w:type="dxa"/>
+          </w:tcPr>
+          <w:p>
+            <w:pPr>
+              <w:spacing w:before="0" w:after="0" w:line="259" w:lineRule="auto"/>
+              <w:jc w:val="left"/>
+            </w:pPr>
+            <w:r>
+              <w:rPr>
+                <w:rFonts w:ascii="Calibri" w:hAnsi="Calibri" w:cs="Calibri"/>
+                <w:color w:val="000000"/>
+                <w:sz w:val="16"/>
+                <w:szCs w:val="16"/>
+              </w:rPr>
+              <w:t xml:space="preserve">Feria de informática</w:t>
+            </w:r>
+          </w:p>
+        </w:tc>
+        <w:tc>
+          <w:tcPr>
+            <w:tcW w:w="1276" w:type="dxa"/>
+          </w:tcPr>
+          <w:p>
+            <w:pPr>
+              <w:spacing w:before="0" w:after="0" w:line="259" w:lineRule="auto"/>
+              <w:jc w:val="left"/>
+            </w:pPr>
+            <w:r>
+              <w:rPr>
+                <w:rFonts w:ascii="Calibri" w:hAnsi="Calibri" w:cs="Calibri"/>
+                <w:color w:val="000000"/>
+                <w:sz w:val="16"/>
+                <w:szCs w:val="16"/>
+              </w:rPr>
+              <w:t xml:space="preserve">-</w:t>
+            </w:r>
+          </w:p>
+        </w:tc>
+        <w:tc>
+          <w:tcPr>
+            <w:tcW w:w="1276" w:type="dxa"/>
+          </w:tcPr>
+          <w:p>
+            <w:pPr>
+              <w:spacing w:before="0" w:after="0" w:line="259" w:lineRule="auto"/>
+              <w:jc w:val="left"/>
+            </w:pPr>
+            <w:r>
+              <w:rPr>
+                <w:rFonts w:ascii="Calibri" w:hAnsi="Calibri" w:cs="Calibri"/>
+                <w:color w:val="000000"/>
+                <w:sz w:val="16"/>
+                <w:szCs w:val="16"/>
+              </w:rPr>
+              <w:t xml:space="preserve">Semana del 26-10</w:t>
+            </w:r>
+          </w:p>
+        </w:tc>
+        <w:tc>
+          <w:tcPr>
+            <w:tcW w:w="1275" w:type="dxa"/>
+          </w:tcPr>
+          <w:p>
+            <w:pPr>
+              <w:spacing w:before="0" w:after="0" w:line="259" w:lineRule="auto"/>
+              <w:jc w:val="left"/>
+            </w:pPr>
+            <w:r>
+              <w:rPr>
+                <w:rFonts w:ascii="Calibri" w:hAnsi="Calibri" w:cs="Calibri"/>
+                <w:color w:val="000000"/>
+                <w:sz w:val="16"/>
+                <w:szCs w:val="16"/>
+              </w:rPr>
+              <w:t xml:space="preserve">Nicko</w:t>
+            </w:r>
+          </w:p>
+        </w:tc>
+        <w:tc>
+          <w:tcPr>
+            <w:tcW w:w="1276" w:type="dxa"/>
+          </w:tcPr>
+          <w:p>
+            <w:pPr>
+              <w:spacing w:before="0" w:after="0" w:line="259" w:lineRule="auto"/>
+              <w:jc w:val="left"/>
+            </w:pPr>
+            <w:r>
+              <w:rPr>
+                <w:rFonts w:ascii="Calibri" w:hAnsi="Calibri" w:cs="Calibri"/>
+                <w:color w:val="000000"/>
+                <w:sz w:val="16"/>
+                <w:szCs w:val="16"/>
+              </w:rPr>
+              <w:t xml:space="preserve">Día y hora por informar</w:t>
+            </w:r>
+          </w:p>
+        </w:tc>
+        <w:tc>
+          <w:tcPr>
+            <w:tcW w:w="1418" w:type="dxa"/>
+          </w:tcPr>
+          <w:p>
+            <w:pPr>
+              <w:spacing w:before="0" w:after="0" w:line="259" w:lineRule="auto"/>
+              <w:jc w:val="left"/>
+            </w:pPr>
+            <w:r>
+              <w:rPr>
+                <w:rFonts w:ascii="Calibri" w:hAnsi="Calibri" w:cs="Calibri"/>
+                <w:color w:val="000000"/>
+                <w:sz w:val="16"/>
+                <w:szCs w:val="16"/>
+              </w:rPr>
+              <w:t xml:space="preserve">No iniciado</w:t>
+            </w:r>
+          </w:p>
+        </w:tc>
+        <w:tc>
+          <w:tcPr>
+            <w:tcW w:w="850" w:type="dxa"/>
+          </w:tcPr>
+          <w:p>
+            <w:pPr>
+              <w:spacing w:before="0" w:after="0" w:line="259" w:lineRule="auto"/>
+              <w:jc w:val="left"/>
+            </w:pPr>
+            <w:r>
+              <w:rPr>
+                <w:rFonts w:ascii="Calibri" w:hAnsi="Calibri" w:cs="Calibri"/>
+                <w:color w:val="000000"/>
+                <w:sz w:val="16"/>
+                <w:szCs w:val="16"/>
+              </w:rPr>
+              <w:t xml:space="preserve">-</w:t>
+            </w:r>
+          </w:p>
+        </w:tc>
+      </w:tr>
+      <w:tr>
         <w:tc>
           <w:tcPr>
             <w:tcW w:w="9776" w:type="dxa"/>
@@ -6306,7 +6471,7 @@
                 <w:sz w:val="16"/>
                 <w:szCs w:val="16"/>
               </w:rPr>
-              <w:t xml:space="preserve">Competencias del perfil de egreso: C1 = diseñar y generar soluciones de software innovadoras y de calidad, aplicando su ciclo de vida; C2 = evaluar y gestionar proyectos de su área durante todo su ciclo de vida; C3 = diseñar y adaptar los procesos de ingeniería de requisitos. Fuente: Carta Gantt de la Fase 2 (Anexos/Gestion/Carta Gantt Fase 2.xlsx), corte 20-10-2026.</w:t>
+              <w:t xml:space="preserve">Competencias del perfil de egreso: C1 = diseñar y generar soluciones de software innovadoras y de calidad, aplicando su ciclo de vida; C2 = evaluar y gestionar proyectos de su área durante todo su ciclo de vida; C3 = diseñar y adaptar los procesos de ingeniería de requisitos. Fuente: Carta Gantt de la Fase 2 (Anexos/Gestion/Carta Gantt Fase 2.xlsx), corte 21-10-2026.</w:t>
             </w:r>
           </w:p>
         </w:tc>
@@ -6729,7 +6894,7 @@
                 <w:sz w:val="22"/>
                 <w:szCs w:val="22"/>
               </w:rPr>
-              <w:t xml:space="preserve"> (36 de 40 Pull Requests). Acción: cada integrante abre los Pull Requests de sus tareas y revisa los de otro (plan de mejoras, M9).</w:t>
+              <w:t xml:space="preserve"> (38 de 52 Pull Requests mergeados al 21-10). Acción: cada integrante abre los Pull Requests de sus tareas y revisa los de otro (plan de mejoras, M9).</w:t>
             </w:r>
           </w:p>
         </w:tc>
@@ -7181,7 +7346,7 @@
                 <w:sz w:val="22"/>
                 <w:szCs w:val="22"/>
               </w:rPr>
-              <w:t xml:space="preserve"> no iniciado; responsable Mariana Ramírez, del 20 al 27-10, para la demo del 31-10.</w:t>
+              <w:t xml:space="preserve"> terminado el 21-10 por Mariana Ramírez, antes del plazo (27-10); se mostrará en la demo del 31-10.</w:t>
             </w:r>
           </w:p>
           <w:p>
@@ -7210,7 +7375,7 @@
                 <w:sz w:val="22"/>
                 <w:szCs w:val="22"/>
               </w:rPr>
-              <w:t xml:space="preserve"> no iniciados y sin responsable. Estrategia: asignarlos en la próxima reunión del equipo; junto con CU04 permiten llegar al 50% de los casos de uso en la Evaluación 2.</w:t>
+              <w:t xml:space="preserve"> no iniciados y sin responsable. Estrategia: asignarlos en la próxima reunión del equipo; con CU04 ya se llegó al 50% de los casos de uso para la Evaluación 2.</w:t>
             </w:r>
           </w:p>
           <w:p>

</xml_diff>

<commit_message>
docs: reflect detector fine-tuning result in progress evidence (#37)
</commit_message>
<xml_diff>
--- a/Fase 2/2.4_GuiaEstudiante_Fase 2_DesarrolloProyecto APT.docx
+++ b/Fase 2/2.4_GuiaEstudiante_Fase 2_DesarrolloProyecto APT.docx
@@ -892,7 +892,7 @@
                 <w:sz w:val="22"/>
                 <w:szCs w:val="22"/>
               </w:rPr>
-              <w:t xml:space="preserve"> mAP50 0,950 en el test de SKU-110K y 0,713 en 45 fotos de Kaggle no usadas al entrenar. Con la cámara girada 35° baja a 0,637, bajo la meta, así que se planificó un fine-tuning.</w:t>
+              <w:t xml:space="preserve"> mAP50 0,950 en el test de SKU-110K y 0,713 en 45 fotos de Kaggle no usadas al entrenar. Con la cámara girada 35° baja a 0,637, bajo la meta. El primer fine-tuning (21-10) la sube a 0,818 en 12 fotos de prueba, pero no se aceptó porque baja el mAP50-95 en el test de SKU-110K de 0,610 a 0,533.</w:t>
             </w:r>
           </w:p>
           <w:p>
@@ -1500,7 +1500,7 @@
                 <w:sz w:val="22"/>
                 <w:szCs w:val="22"/>
               </w:rPr>
-              <w:t xml:space="preserve"> (tests/, .github/workflows/ci.yml): 231 pruebas que corren en cada Pull Request. Demuestra OE5.</w:t>
+              <w:t xml:space="preserve"> (tests/, .github/workflows/ci.yml): 233 pruebas que corren en cada Pull Request. Demuestra OE5.</w:t>
             </w:r>
           </w:p>
           <w:p>
@@ -3953,7 +3953,7 @@
                 <w:sz w:val="16"/>
                 <w:szCs w:val="16"/>
               </w:rPr>
-              <w:t xml:space="preserve">En curso</w:t>
+              <w:t xml:space="preserve">Completado</w:t>
             </w:r>
           </w:p>
         </w:tc>
@@ -3973,7 +3973,7 @@
                 <w:sz w:val="16"/>
                 <w:szCs w:val="16"/>
               </w:rPr>
-              <w:t xml:space="preserve">Fine-tuning planificado</w:t>
+              <w:t xml:space="preserve">Primer fine-tuning (21-10) no aceptado</w:t>
             </w:r>
           </w:p>
         </w:tc>
@@ -6894,7 +6894,7 @@
                 <w:sz w:val="22"/>
                 <w:szCs w:val="22"/>
               </w:rPr>
-              <w:t xml:space="preserve"> (38 de 52 Pull Requests mergeados al 21-10). Acción: cada integrante abre los Pull Requests de sus tareas y revisa los de otro (plan de mejoras, M9).</w:t>
+              <w:t xml:space="preserve"> (39 de 53 Pull Requests mergeados al 21-10). Acción: cada integrante abre los Pull Requests de sus tareas y revisa los de otro (plan de mejoras, M9).</w:t>
             </w:r>
           </w:p>
         </w:tc>
@@ -7317,7 +7317,7 @@
                 <w:sz w:val="22"/>
                 <w:szCs w:val="22"/>
               </w:rPr>
-              <w:t xml:space="preserve"> medido con fotos de Kaggle (licencia CC0), vistas oblicuas y Roboflow. De frente cumple la meta (mAP50 0,713), pero a 35° queda en 0,637. Estrategia: fine-tuning con las fotos de Kaggle separadas en entrenamiento y prueba, y aumentación de giros, color y ruido.</w:t>
+              <w:t xml:space="preserve"> medido con fotos de Kaggle (licencia CC0), vistas oblicuas y Roboflow. De frente cumple la meta (mAP50 0,713), pero a 35° queda en 0,637. El primer fine-tuning (21-10) mejora 35° pero baja el mAP50-95 en SKU-110K a 0,533, así que no se aceptó. Estrategia: repetirlo con más fotos de SKU-110K para no olvidar, una tasa de aprendizaje menor o menos épocas, y después medir con el set de fotos propias (#32).</w:t>
             </w:r>
           </w:p>
           <w:p>

</xml_diff>

<commit_message>
fix: record the accepted detector fine-tuning in progress evidence (#37)
</commit_message>
<xml_diff>
--- a/Fase 2/2.4_GuiaEstudiante_Fase 2_DesarrolloProyecto APT.docx
+++ b/Fase 2/2.4_GuiaEstudiante_Fase 2_DesarrolloProyecto APT.docx
@@ -892,7 +892,7 @@
                 <w:sz w:val="22"/>
                 <w:szCs w:val="22"/>
               </w:rPr>
-              <w:t xml:space="preserve"> mAP50 0,950 en el test de SKU-110K y 0,713 en 45 fotos de Kaggle no usadas al entrenar. Con la cámara girada 35° baja a 0,637, bajo la meta. El primer fine-tuning (21-10) la sube a 0,818 en 12 fotos de prueba, pero no se aceptó porque baja el mAP50-95 en el test de SKU-110K de 0,610 a 0,533.</w:t>
+              <w:t xml:space="preserve"> mAP50 0,950 en el test de SKU-110K y 0,713 en 45 fotos de Kaggle no usadas al entrenar. Con la cámara girada 35° baja a 0,637, bajo la meta. El fine-tuning del 21-10 la sube a 0,818 en 12 fotos de prueba y se aceptó, aunque el mAP50-95 en el test de SKU-110K baja de 0,610 a 0,533, porque SKU-110K no es el dominio de Walmart. Falta confirmarlo con fotos propias y con ruido de cámara de sala.</w:t>
             </w:r>
           </w:p>
           <w:p>
@@ -3973,7 +3973,7 @@
                 <w:sz w:val="16"/>
                 <w:szCs w:val="16"/>
               </w:rPr>
-              <w:t xml:space="preserve">Primer fine-tuning (21-10) no aceptado</w:t>
+              <w:t xml:space="preserve">Fine-tuning aceptado el 21-10</w:t>
             </w:r>
           </w:p>
         </w:tc>
@@ -6894,7 +6894,7 @@
                 <w:sz w:val="22"/>
                 <w:szCs w:val="22"/>
               </w:rPr>
-              <w:t xml:space="preserve"> (39 de 53 Pull Requests mergeados al 21-10). Acción: cada integrante abre los Pull Requests de sus tareas y revisa los de otro (plan de mejoras, M9).</w:t>
+              <w:t xml:space="preserve"> (43 de 61 Pull Requests mergeados al 22-10). Acción: cada integrante abre los Pull Requests de sus tareas y revisa los de otro (plan de mejoras, M9).</w:t>
             </w:r>
           </w:p>
         </w:tc>
@@ -7317,7 +7317,7 @@
                 <w:sz w:val="22"/>
                 <w:szCs w:val="22"/>
               </w:rPr>
-              <w:t xml:space="preserve"> medido con fotos de Kaggle (licencia CC0), vistas oblicuas y Roboflow. De frente cumple la meta (mAP50 0,713), pero a 35° queda en 0,637. El primer fine-tuning (21-10) mejora 35° pero baja el mAP50-95 en SKU-110K a 0,533, así que no se aceptó. Estrategia: repetirlo con más fotos de SKU-110K para no olvidar, una tasa de aprendizaje menor o menos épocas, y después medir con el set de fotos propias (#32).</w:t>
+              <w:t xml:space="preserve"> medido con fotos de Kaggle (licencia CC0), vistas oblicuas y Roboflow. De frente cumple la meta (mAP50 0,713), pero a 35° queda en 0,637. El fine-tuning del 21-10 sube 35° a 0,818 y se aceptó, aunque baja el mAP50-95 en SKU-110K a 0,533. Estrategia: medirlo con el set de fotos propias (#32) y con ruido de cámara de sala (#55, 2026-11-06).</w:t>
             </w:r>
           </w:p>
           <w:p>

</xml_diff>